<commit_message>
Some rework MathData and added lab2 1C
</commit_message>
<xml_diff>
--- a/Network/lab1/lab1.docx
+++ b/Network/lab1/lab1.docx
@@ -174,7 +174,7 @@
           <w:sz w:val="28"/>
           <w:szCs w:val="28"/>
         </w:rPr>
-        <w:t>Структуры и алгоритмы обработки данных</w:t>
+        <w:t>Сетевые технологии</w:t>
       </w:r>
       <w:r>
         <w:rPr>
@@ -324,13 +324,23 @@
         </w:rPr>
         <w:br/>
       </w:r>
-      <w:r>
-        <w:rPr>
-          <w:rFonts w:ascii="Times New Roman" w:hAnsi="Times New Roman" w:cs="Times New Roman"/>
-          <w:sz w:val="28"/>
-          <w:szCs w:val="28"/>
-        </w:rPr>
-        <w:t>Аралушкин М.Д.</w:t>
+      <w:proofErr w:type="spellStart"/>
+      <w:r>
+        <w:rPr>
+          <w:rFonts w:ascii="Times New Roman" w:hAnsi="Times New Roman" w:cs="Times New Roman"/>
+          <w:sz w:val="28"/>
+          <w:szCs w:val="28"/>
+        </w:rPr>
+        <w:t>Аралушкин</w:t>
+      </w:r>
+      <w:proofErr w:type="spellEnd"/>
+      <w:r>
+        <w:rPr>
+          <w:rFonts w:ascii="Times New Roman" w:hAnsi="Times New Roman" w:cs="Times New Roman"/>
+          <w:sz w:val="28"/>
+          <w:szCs w:val="28"/>
+        </w:rPr>
+        <w:t xml:space="preserve"> М.Д.</w:t>
       </w:r>
     </w:p>
     <w:p>
@@ -870,7 +880,6 @@
           <w:rFonts w:ascii="Times New Roman" w:hAnsi="Times New Roman" w:cs="Times New Roman"/>
           <w:sz w:val="28"/>
           <w:szCs w:val="28"/>
-          <w:lang w:val="en-US"/>
         </w:rPr>
       </w:pPr>
       <w:r>
@@ -1141,7 +1150,25 @@
           <w:szCs w:val="28"/>
         </w:rPr>
         <w:lastRenderedPageBreak/>
-        <w:t>Проверил связь соседних пк:</w:t>
+        <w:t xml:space="preserve">Проверил связь соседних </w:t>
+      </w:r>
+      <w:proofErr w:type="spellStart"/>
+      <w:r>
+        <w:rPr>
+          <w:rFonts w:ascii="Times New Roman" w:hAnsi="Times New Roman" w:cs="Times New Roman"/>
+          <w:sz w:val="28"/>
+          <w:szCs w:val="28"/>
+        </w:rPr>
+        <w:t>пк</w:t>
+      </w:r>
+      <w:proofErr w:type="spellEnd"/>
+      <w:r>
+        <w:rPr>
+          <w:rFonts w:ascii="Times New Roman" w:hAnsi="Times New Roman" w:cs="Times New Roman"/>
+          <w:sz w:val="28"/>
+          <w:szCs w:val="28"/>
+        </w:rPr>
+        <w:t>:</w:t>
       </w:r>
     </w:p>
     <w:p>
@@ -1320,95 +1347,7 @@
           <w:szCs w:val="28"/>
         </w:rPr>
         <w:tab/>
-        <w:t>В ходе выполнения данной лабораторной работы я и</w:t>
-      </w:r>
-      <w:r>
-        <w:rPr>
-          <w:rFonts w:ascii="Times New Roman" w:hAnsi="Times New Roman" w:cs="Times New Roman"/>
-          <w:sz w:val="28"/>
-          <w:szCs w:val="28"/>
-        </w:rPr>
-        <w:t>зучи</w:t>
-      </w:r>
-      <w:r>
-        <w:rPr>
-          <w:rFonts w:ascii="Times New Roman" w:hAnsi="Times New Roman" w:cs="Times New Roman"/>
-          <w:sz w:val="28"/>
-          <w:szCs w:val="28"/>
-        </w:rPr>
-        <w:t>л</w:t>
-      </w:r>
-      <w:r>
-        <w:rPr>
-          <w:rFonts w:ascii="Times New Roman" w:hAnsi="Times New Roman" w:cs="Times New Roman"/>
-          <w:sz w:val="28"/>
-          <w:szCs w:val="28"/>
-        </w:rPr>
-        <w:t xml:space="preserve"> принципы построения простейших сетей и их настройки с использованием симулятора компьютерных сетей. Собра</w:t>
-      </w:r>
-      <w:r>
-        <w:rPr>
-          <w:rFonts w:ascii="Times New Roman" w:hAnsi="Times New Roman" w:cs="Times New Roman"/>
-          <w:sz w:val="28"/>
-          <w:szCs w:val="28"/>
-        </w:rPr>
-        <w:t>л</w:t>
-      </w:r>
-      <w:r>
-        <w:rPr>
-          <w:rFonts w:ascii="Times New Roman" w:hAnsi="Times New Roman" w:cs="Times New Roman"/>
-          <w:sz w:val="28"/>
-          <w:szCs w:val="28"/>
-        </w:rPr>
-        <w:t xml:space="preserve"> в соответствии с заданием топологии сетей, запусти</w:t>
-      </w:r>
-      <w:r>
-        <w:rPr>
-          <w:rFonts w:ascii="Times New Roman" w:hAnsi="Times New Roman" w:cs="Times New Roman"/>
-          <w:sz w:val="28"/>
-          <w:szCs w:val="28"/>
-        </w:rPr>
-        <w:t>л</w:t>
-      </w:r>
-      <w:r>
-        <w:rPr>
-          <w:rFonts w:ascii="Times New Roman" w:hAnsi="Times New Roman" w:cs="Times New Roman"/>
-          <w:sz w:val="28"/>
-          <w:szCs w:val="28"/>
-        </w:rPr>
-        <w:t xml:space="preserve"> и настрои</w:t>
-      </w:r>
-      <w:r>
-        <w:rPr>
-          <w:rFonts w:ascii="Times New Roman" w:hAnsi="Times New Roman" w:cs="Times New Roman"/>
-          <w:sz w:val="28"/>
-          <w:szCs w:val="28"/>
-        </w:rPr>
-        <w:t>л</w:t>
-      </w:r>
-      <w:r>
-        <w:rPr>
-          <w:rFonts w:ascii="Times New Roman" w:hAnsi="Times New Roman" w:cs="Times New Roman"/>
-          <w:sz w:val="28"/>
-          <w:szCs w:val="28"/>
-        </w:rPr>
-        <w:t xml:space="preserve"> виртуальное оборудование. Согласно пунктам выполнения практической работы, сдела</w:t>
-      </w:r>
-      <w:r>
-        <w:rPr>
-          <w:rFonts w:ascii="Times New Roman" w:hAnsi="Times New Roman" w:cs="Times New Roman"/>
-          <w:sz w:val="28"/>
-          <w:szCs w:val="28"/>
-        </w:rPr>
-        <w:t>л</w:t>
-      </w:r>
-      <w:r>
-        <w:rPr>
-          <w:rFonts w:ascii="Times New Roman" w:hAnsi="Times New Roman" w:cs="Times New Roman"/>
-          <w:sz w:val="28"/>
-          <w:szCs w:val="28"/>
-        </w:rPr>
-        <w:t xml:space="preserve"> необходимые снимки экрана.</w:t>
+        <w:t>В ходе выполнения данной лабораторной работы я изучил принципы построения простейших сетей и их настройки с использованием симулятора компьютерных сетей. Собрал в соответствии с заданием топологии сетей, запустил и настроил виртуальное оборудование. Согласно пунктам выполнения практической работы, сделал необходимые снимки экрана.</w:t>
       </w:r>
     </w:p>
     <w:p>
@@ -1692,7 +1631,43 @@
           <w:sz w:val="28"/>
           <w:szCs w:val="28"/>
         </w:rPr>
-        <w:t xml:space="preserve">Ее основная функция — накладываться на IP-адрес и делить его на сетевую, подсетевую и хостовую части для управления адресным пространством. </w:t>
+        <w:t xml:space="preserve">Ее основная функция — накладываться на IP-адрес и делить его на сетевую, </w:t>
+      </w:r>
+      <w:proofErr w:type="spellStart"/>
+      <w:r>
+        <w:rPr>
+          <w:rFonts w:ascii="Times New Roman" w:hAnsi="Times New Roman" w:cs="Times New Roman"/>
+          <w:sz w:val="28"/>
+          <w:szCs w:val="28"/>
+        </w:rPr>
+        <w:t>подсетевую</w:t>
+      </w:r>
+      <w:proofErr w:type="spellEnd"/>
+      <w:r>
+        <w:rPr>
+          <w:rFonts w:ascii="Times New Roman" w:hAnsi="Times New Roman" w:cs="Times New Roman"/>
+          <w:sz w:val="28"/>
+          <w:szCs w:val="28"/>
+        </w:rPr>
+        <w:t xml:space="preserve"> и </w:t>
+      </w:r>
+      <w:proofErr w:type="spellStart"/>
+      <w:r>
+        <w:rPr>
+          <w:rFonts w:ascii="Times New Roman" w:hAnsi="Times New Roman" w:cs="Times New Roman"/>
+          <w:sz w:val="28"/>
+          <w:szCs w:val="28"/>
+        </w:rPr>
+        <w:t>хостовую</w:t>
+      </w:r>
+      <w:proofErr w:type="spellEnd"/>
+      <w:r>
+        <w:rPr>
+          <w:rFonts w:ascii="Times New Roman" w:hAnsi="Times New Roman" w:cs="Times New Roman"/>
+          <w:sz w:val="28"/>
+          <w:szCs w:val="28"/>
+        </w:rPr>
+        <w:t xml:space="preserve"> части для управления адресным пространством. </w:t>
       </w:r>
     </w:p>
     <w:p>
@@ -1711,35 +1686,9 @@
           <w:sz w:val="28"/>
           <w:szCs w:val="28"/>
         </w:rPr>
-        <w:t>4. Что такое команда ping? Зачем она нужна?</w:t>
-      </w:r>
-    </w:p>
-    <w:p>
-      <w:pPr>
-        <w:jc w:val="both"/>
-        <w:rPr>
-          <w:rFonts w:ascii="Times New Roman" w:hAnsi="Times New Roman" w:cs="Times New Roman"/>
-          <w:sz w:val="28"/>
-          <w:szCs w:val="28"/>
-        </w:rPr>
-      </w:pPr>
-      <w:r>
-        <w:rPr>
-          <w:rFonts w:ascii="Times New Roman" w:hAnsi="Times New Roman" w:cs="Times New Roman"/>
-          <w:sz w:val="28"/>
-          <w:szCs w:val="28"/>
-        </w:rPr>
-        <w:t xml:space="preserve">Команда ping вводится в командной строке устройства для того, чтобы осуществить проверку наличия связи между компьютерами и другими узлами в сети. </w:t>
-      </w:r>
-    </w:p>
-    <w:p>
-      <w:pPr>
-        <w:rPr>
-          <w:rFonts w:ascii="Times New Roman" w:hAnsi="Times New Roman" w:cs="Times New Roman"/>
-          <w:sz w:val="28"/>
-          <w:szCs w:val="28"/>
-        </w:rPr>
-      </w:pPr>
+        <w:t xml:space="preserve">4. Что такое команда </w:t>
+      </w:r>
+      <w:proofErr w:type="spellStart"/>
       <w:r>
         <w:rPr>
           <w:rFonts w:ascii="Times New Roman" w:hAnsi="Times New Roman" w:cs="Times New Roman"/>
@@ -1748,6 +1697,72 @@
           <w:sz w:val="28"/>
           <w:szCs w:val="28"/>
         </w:rPr>
+        <w:t>ping</w:t>
+      </w:r>
+      <w:proofErr w:type="spellEnd"/>
+      <w:r>
+        <w:rPr>
+          <w:rFonts w:ascii="Times New Roman" w:hAnsi="Times New Roman" w:cs="Times New Roman"/>
+          <w:b/>
+          <w:bCs/>
+          <w:sz w:val="28"/>
+          <w:szCs w:val="28"/>
+        </w:rPr>
+        <w:t>? Зачем она нужна?</w:t>
+      </w:r>
+    </w:p>
+    <w:p>
+      <w:pPr>
+        <w:jc w:val="both"/>
+        <w:rPr>
+          <w:rFonts w:ascii="Times New Roman" w:hAnsi="Times New Roman" w:cs="Times New Roman"/>
+          <w:sz w:val="28"/>
+          <w:szCs w:val="28"/>
+        </w:rPr>
+      </w:pPr>
+      <w:r>
+        <w:rPr>
+          <w:rFonts w:ascii="Times New Roman" w:hAnsi="Times New Roman" w:cs="Times New Roman"/>
+          <w:sz w:val="28"/>
+          <w:szCs w:val="28"/>
+        </w:rPr>
+        <w:t xml:space="preserve">Команда </w:t>
+      </w:r>
+      <w:proofErr w:type="spellStart"/>
+      <w:r>
+        <w:rPr>
+          <w:rFonts w:ascii="Times New Roman" w:hAnsi="Times New Roman" w:cs="Times New Roman"/>
+          <w:sz w:val="28"/>
+          <w:szCs w:val="28"/>
+        </w:rPr>
+        <w:t>ping</w:t>
+      </w:r>
+      <w:proofErr w:type="spellEnd"/>
+      <w:r>
+        <w:rPr>
+          <w:rFonts w:ascii="Times New Roman" w:hAnsi="Times New Roman" w:cs="Times New Roman"/>
+          <w:sz w:val="28"/>
+          <w:szCs w:val="28"/>
+        </w:rPr>
+        <w:t xml:space="preserve"> вводится в командной строке устройства для того, чтобы осуществить проверку наличия связи между компьютерами и другими узлами в сети. </w:t>
+      </w:r>
+    </w:p>
+    <w:p>
+      <w:pPr>
+        <w:rPr>
+          <w:rFonts w:ascii="Times New Roman" w:hAnsi="Times New Roman" w:cs="Times New Roman"/>
+          <w:sz w:val="28"/>
+          <w:szCs w:val="28"/>
+        </w:rPr>
+      </w:pPr>
+      <w:r>
+        <w:rPr>
+          <w:rFonts w:ascii="Times New Roman" w:hAnsi="Times New Roman" w:cs="Times New Roman"/>
+          <w:b/>
+          <w:bCs/>
+          <w:sz w:val="28"/>
+          <w:szCs w:val="28"/>
+        </w:rPr>
         <w:t>5. Что такое «шлюз по умолчанию» и для чего он нужен?</w:t>
       </w:r>
     </w:p>
@@ -1766,7 +1781,25 @@
           <w:sz w:val="28"/>
           <w:szCs w:val="28"/>
         </w:rPr>
-        <w:t>Шлюзом по умолчанию (gateway) является адрес роутера в конкретном сегменте сети.</w:t>
+        <w:t>Шлюзом по умолчанию (</w:t>
+      </w:r>
+      <w:proofErr w:type="spellStart"/>
+      <w:r>
+        <w:rPr>
+          <w:rFonts w:ascii="Times New Roman" w:hAnsi="Times New Roman" w:cs="Times New Roman"/>
+          <w:sz w:val="28"/>
+          <w:szCs w:val="28"/>
+        </w:rPr>
+        <w:t>gateway</w:t>
+      </w:r>
+      <w:proofErr w:type="spellEnd"/>
+      <w:r>
+        <w:rPr>
+          <w:rFonts w:ascii="Times New Roman" w:hAnsi="Times New Roman" w:cs="Times New Roman"/>
+          <w:sz w:val="28"/>
+          <w:szCs w:val="28"/>
+        </w:rPr>
+        <w:t>) является адрес роутера в конкретном сегменте сети.</w:t>
       </w:r>
       <w:r>
         <w:rPr>
@@ -3171,6 +3204,7 @@
   <w:style w:type="character" w:default="1" w:styleId="a0">
     <w:name w:val="Default Paragraph Font"/>
     <w:uiPriority w:val="1"/>
+    <w:semiHidden/>
     <w:unhideWhenUsed/>
   </w:style>
   <w:style w:type="table" w:default="1" w:styleId="a1">

</xml_diff>